<commit_message>
Sync documentation with main
</commit_message>
<xml_diff>
--- a/Documentation/Role Schedule/Role Schedule.docx
+++ b/Documentation/Role Schedule/Role Schedule.docx
@@ -10,13 +10,13 @@
         <w:tblLook w:val="04A0" w:firstRow="1" w:lastRow="0" w:firstColumn="1" w:lastColumn="0" w:noHBand="0" w:noVBand="1"/>
       </w:tblPr>
       <w:tblGrid>
-        <w:gridCol w:w="2127"/>
+        <w:gridCol w:w="1423"/>
+        <w:gridCol w:w="2263"/>
+        <w:gridCol w:w="2552"/>
         <w:gridCol w:w="1984"/>
-        <w:gridCol w:w="2127"/>
-        <w:gridCol w:w="2268"/>
-        <w:gridCol w:w="2268"/>
-        <w:gridCol w:w="2409"/>
-        <w:gridCol w:w="2352"/>
+        <w:gridCol w:w="2309"/>
+        <w:gridCol w:w="2269"/>
+        <w:gridCol w:w="2735"/>
       </w:tblGrid>
       <w:tr>
         <w:trPr>
@@ -24,12 +24,34 @@
         </w:trPr>
         <w:tc>
           <w:tcPr>
-            <w:tcW w:w="2127" w:type="dxa"/>
+            <w:tcW w:w="1423" w:type="dxa"/>
             <w:shd w:val="clear" w:color="auto" w:fill="83CAEB" w:themeFill="accent1" w:themeFillTint="66"/>
           </w:tcPr>
           <w:p>
             <w:r>
               <w:t>Role</w:t>
+            </w:r>
+          </w:p>
+        </w:tc>
+        <w:tc>
+          <w:tcPr>
+            <w:tcW w:w="2263" w:type="dxa"/>
+            <w:shd w:val="clear" w:color="auto" w:fill="F2CEED" w:themeFill="accent5" w:themeFillTint="33"/>
+          </w:tcPr>
+          <w:p>
+            <w:r>
+              <w:t>Week 1</w:t>
+            </w:r>
+          </w:p>
+        </w:tc>
+        <w:tc>
+          <w:tcPr>
+            <w:tcW w:w="2552" w:type="dxa"/>
+            <w:shd w:val="clear" w:color="auto" w:fill="F2CEED" w:themeFill="accent5" w:themeFillTint="33"/>
+          </w:tcPr>
+          <w:p>
+            <w:r>
+              <w:t>Week 2</w:t>
             </w:r>
           </w:p>
         </w:tc>
@@ -40,57 +62,35 @@
           </w:tcPr>
           <w:p>
             <w:r>
-              <w:t>Week 1</w:t>
-            </w:r>
-          </w:p>
-        </w:tc>
-        <w:tc>
-          <w:tcPr>
-            <w:tcW w:w="2127" w:type="dxa"/>
+              <w:t>Week 3</w:t>
+            </w:r>
+          </w:p>
+        </w:tc>
+        <w:tc>
+          <w:tcPr>
+            <w:tcW w:w="2309" w:type="dxa"/>
             <w:shd w:val="clear" w:color="auto" w:fill="F2CEED" w:themeFill="accent5" w:themeFillTint="33"/>
           </w:tcPr>
           <w:p>
             <w:r>
-              <w:t>Week 2</w:t>
-            </w:r>
-          </w:p>
-        </w:tc>
-        <w:tc>
-          <w:tcPr>
-            <w:tcW w:w="2268" w:type="dxa"/>
+              <w:t xml:space="preserve">Week4 </w:t>
+            </w:r>
+          </w:p>
+        </w:tc>
+        <w:tc>
+          <w:tcPr>
+            <w:tcW w:w="2269" w:type="dxa"/>
             <w:shd w:val="clear" w:color="auto" w:fill="F2CEED" w:themeFill="accent5" w:themeFillTint="33"/>
           </w:tcPr>
           <w:p>
             <w:r>
-              <w:t>Week 3</w:t>
-            </w:r>
-          </w:p>
-        </w:tc>
-        <w:tc>
-          <w:tcPr>
-            <w:tcW w:w="2268" w:type="dxa"/>
-            <w:shd w:val="clear" w:color="auto" w:fill="F2CEED" w:themeFill="accent5" w:themeFillTint="33"/>
-          </w:tcPr>
-          <w:p>
-            <w:r>
-              <w:t xml:space="preserve">Week4 </w:t>
-            </w:r>
-          </w:p>
-        </w:tc>
-        <w:tc>
-          <w:tcPr>
-            <w:tcW w:w="2409" w:type="dxa"/>
-            <w:shd w:val="clear" w:color="auto" w:fill="F2CEED" w:themeFill="accent5" w:themeFillTint="33"/>
-          </w:tcPr>
-          <w:p>
-            <w:r>
               <w:t>Week 5</w:t>
             </w:r>
           </w:p>
         </w:tc>
         <w:tc>
           <w:tcPr>
-            <w:tcW w:w="2352" w:type="dxa"/>
+            <w:tcW w:w="2735" w:type="dxa"/>
             <w:shd w:val="clear" w:color="auto" w:fill="F2CEED" w:themeFill="accent5" w:themeFillTint="33"/>
           </w:tcPr>
           <w:p>
@@ -106,98 +106,80 @@
         </w:trPr>
         <w:tc>
           <w:tcPr>
-            <w:tcW w:w="2127" w:type="dxa"/>
+            <w:tcW w:w="1423" w:type="dxa"/>
             <w:shd w:val="clear" w:color="auto" w:fill="83CAEB" w:themeFill="accent1" w:themeFillTint="66"/>
           </w:tcPr>
-          <w:p/>
-          <w:p/>
-          <w:p>
-            <w:r>
-              <w:t>C</w:t>
-            </w:r>
-            <w:r>
-              <w:t xml:space="preserve">hristo </w:t>
-            </w:r>
-            <w:r>
-              <w:t>W</w:t>
+          <w:p>
+            <w:r>
+              <w:t>Project Manager</w:t>
+            </w:r>
+          </w:p>
+        </w:tc>
+        <w:tc>
+          <w:tcPr>
+            <w:tcW w:w="2263" w:type="dxa"/>
+            <w:shd w:val="clear" w:color="auto" w:fill="D86DCB" w:themeFill="accent5" w:themeFillTint="99"/>
+          </w:tcPr>
+          <w:p>
+            <w:r>
+              <w:t>CW</w:t>
+            </w:r>
+          </w:p>
+        </w:tc>
+        <w:tc>
+          <w:tcPr>
+            <w:tcW w:w="2552" w:type="dxa"/>
+            <w:shd w:val="clear" w:color="auto" w:fill="D86DCB" w:themeFill="accent5" w:themeFillTint="99"/>
+          </w:tcPr>
+          <w:p>
+            <w:r>
+              <w:t>CW</w:t>
             </w:r>
           </w:p>
         </w:tc>
         <w:tc>
           <w:tcPr>
             <w:tcW w:w="1984" w:type="dxa"/>
-          </w:tcPr>
-          <w:p>
-            <w:r>
-              <w:t>Project Manager</w:t>
-            </w:r>
-          </w:p>
-        </w:tc>
-        <w:tc>
-          <w:tcPr>
-            <w:tcW w:w="2127" w:type="dxa"/>
-          </w:tcPr>
-          <w:p>
-            <w:r>
-              <w:t>Project Manager</w:t>
-            </w:r>
-          </w:p>
-        </w:tc>
-        <w:tc>
-          <w:tcPr>
-            <w:tcW w:w="2268" w:type="dxa"/>
-          </w:tcPr>
-          <w:p>
-            <w:r>
-              <w:t>Project Manager</w:t>
-            </w:r>
-          </w:p>
-          <w:p>
-            <w:r>
-              <w:t>&amp;</w:t>
-            </w:r>
-          </w:p>
-          <w:p>
-            <w:r>
-              <w:t>Gesture Recognition Team</w:t>
-            </w:r>
-          </w:p>
-        </w:tc>
-        <w:tc>
-          <w:tcPr>
-            <w:tcW w:w="2268" w:type="dxa"/>
-          </w:tcPr>
-          <w:p>
-            <w:r>
-              <w:t>Project Manager</w:t>
-            </w:r>
-          </w:p>
-          <w:p>
-            <w:r>
-              <w:t>&amp;</w:t>
-            </w:r>
-          </w:p>
-          <w:p>
-            <w:r>
-              <w:t>Gesture Recognition Team</w:t>
-            </w:r>
-          </w:p>
-        </w:tc>
-        <w:tc>
-          <w:tcPr>
-            <w:tcW w:w="2409" w:type="dxa"/>
-          </w:tcPr>
-          <w:p>
-            <w:r>
-              <w:t>Gesture Recognition Team</w:t>
-            </w:r>
-          </w:p>
-        </w:tc>
-        <w:tc>
-          <w:tcPr>
-            <w:tcW w:w="2352" w:type="dxa"/>
-          </w:tcPr>
-          <w:p/>
+            <w:shd w:val="clear" w:color="auto" w:fill="D86DCB" w:themeFill="accent5" w:themeFillTint="99"/>
+          </w:tcPr>
+          <w:p>
+            <w:r>
+              <w:t>CW</w:t>
+            </w:r>
+          </w:p>
+        </w:tc>
+        <w:tc>
+          <w:tcPr>
+            <w:tcW w:w="2309" w:type="dxa"/>
+            <w:shd w:val="clear" w:color="auto" w:fill="D86DCB" w:themeFill="accent5" w:themeFillTint="99"/>
+          </w:tcPr>
+          <w:p>
+            <w:r>
+              <w:t>CW</w:t>
+            </w:r>
+          </w:p>
+        </w:tc>
+        <w:tc>
+          <w:tcPr>
+            <w:tcW w:w="2269" w:type="dxa"/>
+            <w:shd w:val="clear" w:color="auto" w:fill="BF4E14" w:themeFill="accent2" w:themeFillShade="BF"/>
+          </w:tcPr>
+          <w:p>
+            <w:r>
+              <w:t>DH</w:t>
+            </w:r>
+          </w:p>
+        </w:tc>
+        <w:tc>
+          <w:tcPr>
+            <w:tcW w:w="2735" w:type="dxa"/>
+            <w:shd w:val="clear" w:color="auto" w:fill="BF4E14" w:themeFill="accent2" w:themeFillShade="BF"/>
+          </w:tcPr>
+          <w:p>
+            <w:r>
+              <w:t>DH</w:t>
+            </w:r>
+          </w:p>
         </w:tc>
       </w:tr>
       <w:tr>
@@ -206,105 +188,83 @@
         </w:trPr>
         <w:tc>
           <w:tcPr>
-            <w:tcW w:w="2127" w:type="dxa"/>
+            <w:tcW w:w="1423" w:type="dxa"/>
             <w:shd w:val="clear" w:color="auto" w:fill="83CAEB" w:themeFill="accent1" w:themeFillTint="66"/>
           </w:tcPr>
-          <w:p/>
-          <w:p/>
-          <w:p>
-            <w:proofErr w:type="spellStart"/>
+          <w:p>
+            <w:r>
+              <w:t>Developer / Customer Contact</w:t>
+            </w:r>
+          </w:p>
+        </w:tc>
+        <w:tc>
+          <w:tcPr>
+            <w:tcW w:w="2263" w:type="dxa"/>
+            <w:shd w:val="clear" w:color="auto" w:fill="EE0000"/>
+          </w:tcPr>
+          <w:p>
             <w:r>
               <w:t>D</w:t>
             </w:r>
             <w:r>
-              <w:t>hava</w:t>
-            </w:r>
-            <w:proofErr w:type="spellEnd"/>
-            <w:r>
-              <w:t xml:space="preserve"> </w:t>
-            </w:r>
-            <w:r>
               <w:t>WA</w:t>
             </w:r>
           </w:p>
         </w:tc>
         <w:tc>
           <w:tcPr>
+            <w:tcW w:w="2552" w:type="dxa"/>
+            <w:shd w:val="clear" w:color="auto" w:fill="EE0000"/>
+          </w:tcPr>
+          <w:p>
+            <w:r>
+              <w:t>DWA</w:t>
+            </w:r>
+          </w:p>
+        </w:tc>
+        <w:tc>
+          <w:tcPr>
             <w:tcW w:w="1984" w:type="dxa"/>
+            <w:shd w:val="clear" w:color="auto" w:fill="EE0000"/>
+          </w:tcPr>
+          <w:p>
+            <w:r>
+              <w:t>DWA</w:t>
+            </w:r>
+          </w:p>
+        </w:tc>
+        <w:tc>
+          <w:tcPr>
+            <w:tcW w:w="2309" w:type="dxa"/>
+            <w:shd w:val="clear" w:color="auto" w:fill="EE0000"/>
+          </w:tcPr>
+          <w:p>
+            <w:r>
+              <w:t>DWA</w:t>
+            </w:r>
+          </w:p>
+        </w:tc>
+        <w:tc>
+          <w:tcPr>
+            <w:tcW w:w="2269" w:type="dxa"/>
             <w:shd w:val="clear" w:color="auto" w:fill="ADADAD" w:themeFill="background2" w:themeFillShade="BF"/>
           </w:tcPr>
           <w:p>
             <w:r>
-              <w:t>N/A</w:t>
-            </w:r>
-          </w:p>
-        </w:tc>
-        <w:tc>
-          <w:tcPr>
-            <w:tcW w:w="2127" w:type="dxa"/>
-          </w:tcPr>
-          <w:p>
-            <w:r>
-              <w:t>Customer Contact</w:t>
-            </w:r>
-          </w:p>
-        </w:tc>
-        <w:tc>
-          <w:tcPr>
-            <w:tcW w:w="2268" w:type="dxa"/>
-          </w:tcPr>
-          <w:p>
-            <w:r>
-              <w:t>Customer Contact</w:t>
-            </w:r>
-          </w:p>
-          <w:p>
-            <w:r>
-              <w:t>&amp;</w:t>
-            </w:r>
-          </w:p>
-          <w:p>
-            <w:r>
-              <w:t>Person Identification Team</w:t>
-            </w:r>
-          </w:p>
-        </w:tc>
-        <w:tc>
-          <w:tcPr>
-            <w:tcW w:w="2268" w:type="dxa"/>
-          </w:tcPr>
-          <w:p>
-            <w:r>
-              <w:t>Customer Contact</w:t>
-            </w:r>
-          </w:p>
-          <w:p>
-            <w:r>
-              <w:t>&amp;</w:t>
-            </w:r>
-          </w:p>
-          <w:p>
-            <w:r>
-              <w:t>Person Identification Team</w:t>
-            </w:r>
-          </w:p>
-        </w:tc>
-        <w:tc>
-          <w:tcPr>
-            <w:tcW w:w="2409" w:type="dxa"/>
-          </w:tcPr>
-          <w:p/>
-          <w:p>
-            <w:r>
-              <w:t>Person Identification Team</w:t>
-            </w:r>
-          </w:p>
-        </w:tc>
-        <w:tc>
-          <w:tcPr>
-            <w:tcW w:w="2352" w:type="dxa"/>
-          </w:tcPr>
-          <w:p/>
+              <w:t>MC</w:t>
+            </w:r>
+          </w:p>
+        </w:tc>
+        <w:tc>
+          <w:tcPr>
+            <w:tcW w:w="2735" w:type="dxa"/>
+            <w:shd w:val="clear" w:color="auto" w:fill="ADADAD" w:themeFill="background2" w:themeFillShade="BF"/>
+          </w:tcPr>
+          <w:p>
+            <w:r>
+              <w:t>MC</w:t>
+            </w:r>
+          </w:p>
         </w:tc>
       </w:tr>
       <w:tr>
@@ -313,87 +273,80 @@
         </w:trPr>
         <w:tc>
           <w:tcPr>
-            <w:tcW w:w="2127" w:type="dxa"/>
+            <w:tcW w:w="1423" w:type="dxa"/>
             <w:shd w:val="clear" w:color="auto" w:fill="83CAEB" w:themeFill="accent1" w:themeFillTint="66"/>
           </w:tcPr>
-          <w:p/>
-          <w:p/>
-          <w:p>
-            <w:proofErr w:type="spellStart"/>
-            <w:r>
-              <w:t>L</w:t>
-            </w:r>
-            <w:r>
-              <w:t>ithasa</w:t>
-            </w:r>
-            <w:proofErr w:type="spellEnd"/>
-            <w:r>
-              <w:t xml:space="preserve"> </w:t>
-            </w:r>
-            <w:r>
-              <w:t>M</w:t>
+          <w:p>
+            <w:r>
+              <w:t>Developer</w:t>
+            </w:r>
+          </w:p>
+        </w:tc>
+        <w:tc>
+          <w:tcPr>
+            <w:tcW w:w="2263" w:type="dxa"/>
+            <w:shd w:val="clear" w:color="auto" w:fill="BF4E14" w:themeFill="accent2" w:themeFillShade="BF"/>
+          </w:tcPr>
+          <w:p>
+            <w:r>
+              <w:t>DH</w:t>
+            </w:r>
+          </w:p>
+        </w:tc>
+        <w:tc>
+          <w:tcPr>
+            <w:tcW w:w="2552" w:type="dxa"/>
+            <w:shd w:val="clear" w:color="auto" w:fill="BF4E14" w:themeFill="accent2" w:themeFillShade="BF"/>
+          </w:tcPr>
+          <w:p>
+            <w:r>
+              <w:t>DH</w:t>
             </w:r>
           </w:p>
         </w:tc>
         <w:tc>
           <w:tcPr>
             <w:tcW w:w="1984" w:type="dxa"/>
-            <w:shd w:val="clear" w:color="auto" w:fill="ADADAD" w:themeFill="background2" w:themeFillShade="BF"/>
-          </w:tcPr>
-          <w:p>
-            <w:r>
-              <w:t xml:space="preserve"> N/A</w:t>
-            </w:r>
-          </w:p>
-        </w:tc>
-        <w:tc>
-          <w:tcPr>
-            <w:tcW w:w="2127" w:type="dxa"/>
-          </w:tcPr>
-          <w:p>
-            <w:r>
-              <w:t>Scope Research</w:t>
-            </w:r>
-          </w:p>
-        </w:tc>
-        <w:tc>
-          <w:tcPr>
-            <w:tcW w:w="2268" w:type="dxa"/>
-          </w:tcPr>
-          <w:p/>
-          <w:p>
-            <w:r>
-              <w:t>Person Identification Team</w:t>
-            </w:r>
-          </w:p>
-        </w:tc>
-        <w:tc>
-          <w:tcPr>
-            <w:tcW w:w="2268" w:type="dxa"/>
-          </w:tcPr>
-          <w:p/>
-          <w:p>
-            <w:r>
-              <w:t>Person Identification Team</w:t>
-            </w:r>
-          </w:p>
-        </w:tc>
-        <w:tc>
-          <w:tcPr>
-            <w:tcW w:w="2409" w:type="dxa"/>
-          </w:tcPr>
-          <w:p/>
-          <w:p>
-            <w:r>
-              <w:t>Person Identification Team</w:t>
-            </w:r>
-          </w:p>
-        </w:tc>
-        <w:tc>
-          <w:tcPr>
-            <w:tcW w:w="2352" w:type="dxa"/>
-          </w:tcPr>
-          <w:p/>
+            <w:shd w:val="clear" w:color="auto" w:fill="BF4E14" w:themeFill="accent2" w:themeFillShade="BF"/>
+          </w:tcPr>
+          <w:p>
+            <w:r>
+              <w:t>DH</w:t>
+            </w:r>
+          </w:p>
+        </w:tc>
+        <w:tc>
+          <w:tcPr>
+            <w:tcW w:w="2309" w:type="dxa"/>
+            <w:shd w:val="clear" w:color="auto" w:fill="BF4E14" w:themeFill="accent2" w:themeFillShade="BF"/>
+          </w:tcPr>
+          <w:p>
+            <w:r>
+              <w:t>DH</w:t>
+            </w:r>
+          </w:p>
+        </w:tc>
+        <w:tc>
+          <w:tcPr>
+            <w:tcW w:w="2269" w:type="dxa"/>
+            <w:shd w:val="clear" w:color="auto" w:fill="84E290" w:themeFill="accent3" w:themeFillTint="66"/>
+          </w:tcPr>
+          <w:p>
+            <w:r>
+              <w:t>TZ</w:t>
+            </w:r>
+          </w:p>
+        </w:tc>
+        <w:tc>
+          <w:tcPr>
+            <w:tcW w:w="2735" w:type="dxa"/>
+            <w:shd w:val="clear" w:color="auto" w:fill="84E290" w:themeFill="accent3" w:themeFillTint="66"/>
+          </w:tcPr>
+          <w:p>
+            <w:r>
+              <w:t>TZ</w:t>
+            </w:r>
+          </w:p>
         </w:tc>
       </w:tr>
       <w:tr>
@@ -402,20 +355,34 @@
         </w:trPr>
         <w:tc>
           <w:tcPr>
-            <w:tcW w:w="2127" w:type="dxa"/>
+            <w:tcW w:w="1423" w:type="dxa"/>
             <w:shd w:val="clear" w:color="auto" w:fill="83CAEB" w:themeFill="accent1" w:themeFillTint="66"/>
           </w:tcPr>
-          <w:p/>
-          <w:p/>
-          <w:p>
-            <w:r>
-              <w:t>D</w:t>
-            </w:r>
-            <w:r>
-              <w:t xml:space="preserve">ylan </w:t>
-            </w:r>
-            <w:r>
-              <w:t>H</w:t>
+          <w:p>
+            <w:r>
+              <w:t>Developer</w:t>
+            </w:r>
+          </w:p>
+        </w:tc>
+        <w:tc>
+          <w:tcPr>
+            <w:tcW w:w="2263" w:type="dxa"/>
+            <w:shd w:val="clear" w:color="auto" w:fill="ADADAD" w:themeFill="background2" w:themeFillShade="BF"/>
+          </w:tcPr>
+          <w:p>
+            <w:r>
+              <w:t>MC</w:t>
+            </w:r>
+          </w:p>
+        </w:tc>
+        <w:tc>
+          <w:tcPr>
+            <w:tcW w:w="2552" w:type="dxa"/>
+            <w:shd w:val="clear" w:color="auto" w:fill="ADADAD" w:themeFill="background2" w:themeFillShade="BF"/>
+          </w:tcPr>
+          <w:p>
+            <w:r>
+              <w:t>MC</w:t>
             </w:r>
           </w:p>
         </w:tc>
@@ -426,69 +393,40 @@
           </w:tcPr>
           <w:p>
             <w:r>
-              <w:t>N/A</w:t>
-            </w:r>
-          </w:p>
-        </w:tc>
-        <w:tc>
-          <w:tcPr>
-            <w:tcW w:w="2127" w:type="dxa"/>
-          </w:tcPr>
-          <w:p>
-            <w:r>
-              <w:t>Scope Research</w:t>
-            </w:r>
-          </w:p>
-        </w:tc>
-        <w:tc>
-          <w:tcPr>
-            <w:tcW w:w="2268" w:type="dxa"/>
-          </w:tcPr>
-          <w:p/>
-          <w:p>
-            <w:r>
-              <w:t>Person Identification Team</w:t>
-            </w:r>
-          </w:p>
-        </w:tc>
-        <w:tc>
-          <w:tcPr>
-            <w:tcW w:w="2268" w:type="dxa"/>
-          </w:tcPr>
-          <w:p/>
-          <w:p>
-            <w:r>
-              <w:t>Person Identification Team</w:t>
-            </w:r>
-          </w:p>
-        </w:tc>
-        <w:tc>
-          <w:tcPr>
-            <w:tcW w:w="2409" w:type="dxa"/>
-          </w:tcPr>
-          <w:p>
-            <w:r>
-              <w:t>Project Manager</w:t>
-            </w:r>
-          </w:p>
-          <w:p>
-            <w:r>
-              <w:t>&amp;</w:t>
-            </w:r>
-          </w:p>
-          <w:p>
-            <w:r>
-              <w:t>Person Identification Team</w:t>
-            </w:r>
-          </w:p>
-        </w:tc>
-        <w:tc>
-          <w:tcPr>
-            <w:tcW w:w="2352" w:type="dxa"/>
-          </w:tcPr>
-          <w:p>
-            <w:r>
-              <w:t>Project Manager</w:t>
+              <w:t>MC</w:t>
+            </w:r>
+          </w:p>
+        </w:tc>
+        <w:tc>
+          <w:tcPr>
+            <w:tcW w:w="2309" w:type="dxa"/>
+            <w:shd w:val="clear" w:color="auto" w:fill="ADADAD" w:themeFill="background2" w:themeFillShade="BF"/>
+          </w:tcPr>
+          <w:p>
+            <w:r>
+              <w:t>MC</w:t>
+            </w:r>
+          </w:p>
+        </w:tc>
+        <w:tc>
+          <w:tcPr>
+            <w:tcW w:w="2269" w:type="dxa"/>
+            <w:shd w:val="clear" w:color="auto" w:fill="074F6A" w:themeFill="accent4" w:themeFillShade="80"/>
+          </w:tcPr>
+          <w:p>
+            <w:r>
+              <w:t>LM</w:t>
+            </w:r>
+          </w:p>
+        </w:tc>
+        <w:tc>
+          <w:tcPr>
+            <w:tcW w:w="2735" w:type="dxa"/>
+            <w:shd w:val="clear" w:color="auto" w:fill="074F6A" w:themeFill="accent4" w:themeFillShade="80"/>
+          </w:tcPr>
+          <w:p>
+            <w:r>
+              <w:t>LM</w:t>
             </w:r>
           </w:p>
         </w:tc>
@@ -499,82 +437,80 @@
         </w:trPr>
         <w:tc>
           <w:tcPr>
-            <w:tcW w:w="2127" w:type="dxa"/>
+            <w:tcW w:w="1423" w:type="dxa"/>
             <w:shd w:val="clear" w:color="auto" w:fill="83CAEB" w:themeFill="accent1" w:themeFillTint="66"/>
           </w:tcPr>
-          <w:p/>
-          <w:p/>
-          <w:p>
-            <w:r>
-              <w:t>T</w:t>
-            </w:r>
-            <w:r>
-              <w:t xml:space="preserve">erry </w:t>
-            </w:r>
-            <w:r>
-              <w:t>Z</w:t>
+          <w:p>
+            <w:r>
+              <w:t>Developer</w:t>
+            </w:r>
+          </w:p>
+        </w:tc>
+        <w:tc>
+          <w:tcPr>
+            <w:tcW w:w="2263" w:type="dxa"/>
+            <w:shd w:val="clear" w:color="auto" w:fill="84E290" w:themeFill="accent3" w:themeFillTint="66"/>
+          </w:tcPr>
+          <w:p>
+            <w:r>
+              <w:t>TZ</w:t>
+            </w:r>
+          </w:p>
+        </w:tc>
+        <w:tc>
+          <w:tcPr>
+            <w:tcW w:w="2552" w:type="dxa"/>
+            <w:shd w:val="clear" w:color="auto" w:fill="84E290" w:themeFill="accent3" w:themeFillTint="66"/>
+          </w:tcPr>
+          <w:p>
+            <w:r>
+              <w:t>TZ</w:t>
             </w:r>
           </w:p>
         </w:tc>
         <w:tc>
           <w:tcPr>
             <w:tcW w:w="1984" w:type="dxa"/>
-            <w:shd w:val="clear" w:color="auto" w:fill="ADADAD" w:themeFill="background2" w:themeFillShade="BF"/>
-          </w:tcPr>
-          <w:p>
-            <w:r>
-              <w:t>N/A</w:t>
-            </w:r>
-          </w:p>
-        </w:tc>
-        <w:tc>
-          <w:tcPr>
-            <w:tcW w:w="2127" w:type="dxa"/>
-          </w:tcPr>
-          <w:p>
-            <w:r>
-              <w:t>Scope Research</w:t>
-            </w:r>
-          </w:p>
-        </w:tc>
-        <w:tc>
-          <w:tcPr>
-            <w:tcW w:w="2268" w:type="dxa"/>
-          </w:tcPr>
-          <w:p/>
-          <w:p>
-            <w:r>
-              <w:t>Gesture Recognition Team</w:t>
-            </w:r>
-          </w:p>
-        </w:tc>
-        <w:tc>
-          <w:tcPr>
-            <w:tcW w:w="2268" w:type="dxa"/>
-          </w:tcPr>
-          <w:p/>
-          <w:p>
-            <w:r>
-              <w:t>Gesture Recognition Team</w:t>
-            </w:r>
-          </w:p>
-        </w:tc>
-        <w:tc>
-          <w:tcPr>
-            <w:tcW w:w="2409" w:type="dxa"/>
-          </w:tcPr>
-          <w:p/>
-          <w:p>
-            <w:r>
-              <w:t>Gesture Recognition Team</w:t>
-            </w:r>
-          </w:p>
-        </w:tc>
-        <w:tc>
-          <w:tcPr>
-            <w:tcW w:w="2352" w:type="dxa"/>
-          </w:tcPr>
-          <w:p/>
+            <w:shd w:val="clear" w:color="auto" w:fill="84E290" w:themeFill="accent3" w:themeFillTint="66"/>
+          </w:tcPr>
+          <w:p>
+            <w:r>
+              <w:t>TZ</w:t>
+            </w:r>
+          </w:p>
+        </w:tc>
+        <w:tc>
+          <w:tcPr>
+            <w:tcW w:w="2309" w:type="dxa"/>
+            <w:shd w:val="clear" w:color="auto" w:fill="84E290" w:themeFill="accent3" w:themeFillTint="66"/>
+          </w:tcPr>
+          <w:p>
+            <w:r>
+              <w:t>TZ</w:t>
+            </w:r>
+          </w:p>
+        </w:tc>
+        <w:tc>
+          <w:tcPr>
+            <w:tcW w:w="2269" w:type="dxa"/>
+            <w:shd w:val="clear" w:color="auto" w:fill="EE0000"/>
+          </w:tcPr>
+          <w:p>
+            <w:r>
+              <w:t>DWA</w:t>
+            </w:r>
+          </w:p>
+        </w:tc>
+        <w:tc>
+          <w:tcPr>
+            <w:tcW w:w="2735" w:type="dxa"/>
+            <w:shd w:val="clear" w:color="auto" w:fill="EE0000"/>
+          </w:tcPr>
+          <w:p>
+            <w:r>
+              <w:t>DWA</w:t>
+            </w:r>
+          </w:p>
         </w:tc>
       </w:tr>
       <w:tr>
@@ -583,93 +519,78 @@
         </w:trPr>
         <w:tc>
           <w:tcPr>
-            <w:tcW w:w="2127" w:type="dxa"/>
+            <w:tcW w:w="1423" w:type="dxa"/>
             <w:shd w:val="clear" w:color="auto" w:fill="83CAEB" w:themeFill="accent1" w:themeFillTint="66"/>
           </w:tcPr>
-          <w:p/>
-          <w:p/>
-          <w:p>
-            <w:r>
-              <w:t>M</w:t>
-            </w:r>
-            <w:r>
-              <w:t xml:space="preserve">urphy </w:t>
-            </w:r>
-            <w:r>
-              <w:t>C</w:t>
+          <w:p>
+            <w:r>
+              <w:t>Tester</w:t>
+            </w:r>
+          </w:p>
+        </w:tc>
+        <w:tc>
+          <w:tcPr>
+            <w:tcW w:w="2263" w:type="dxa"/>
+            <w:shd w:val="clear" w:color="auto" w:fill="074F6A" w:themeFill="accent4" w:themeFillShade="80"/>
+          </w:tcPr>
+          <w:p>
+            <w:r>
+              <w:t>LM</w:t>
+            </w:r>
+          </w:p>
+        </w:tc>
+        <w:tc>
+          <w:tcPr>
+            <w:tcW w:w="2552" w:type="dxa"/>
+            <w:shd w:val="clear" w:color="auto" w:fill="074F6A" w:themeFill="accent4" w:themeFillShade="80"/>
+          </w:tcPr>
+          <w:p>
+            <w:r>
+              <w:t>LM</w:t>
             </w:r>
           </w:p>
         </w:tc>
         <w:tc>
           <w:tcPr>
             <w:tcW w:w="1984" w:type="dxa"/>
-            <w:shd w:val="clear" w:color="auto" w:fill="ADADAD" w:themeFill="background2" w:themeFillShade="BF"/>
-          </w:tcPr>
-          <w:p>
-            <w:r>
-              <w:t>N/A</w:t>
-            </w:r>
-          </w:p>
-        </w:tc>
-        <w:tc>
-          <w:tcPr>
-            <w:tcW w:w="2127" w:type="dxa"/>
-          </w:tcPr>
-          <w:p>
-            <w:r>
-              <w:t>Scope Research</w:t>
-            </w:r>
-          </w:p>
-        </w:tc>
-        <w:tc>
-          <w:tcPr>
-            <w:tcW w:w="2268" w:type="dxa"/>
-          </w:tcPr>
-          <w:p/>
-          <w:p>
-            <w:r>
-              <w:t>Gesture Recognition Team</w:t>
-            </w:r>
-          </w:p>
-        </w:tc>
-        <w:tc>
-          <w:tcPr>
-            <w:tcW w:w="2268" w:type="dxa"/>
-          </w:tcPr>
-          <w:p/>
-          <w:p>
-            <w:r>
-              <w:t>Gesture Recognition Team</w:t>
-            </w:r>
-          </w:p>
-        </w:tc>
-        <w:tc>
-          <w:tcPr>
-            <w:tcW w:w="2409" w:type="dxa"/>
-          </w:tcPr>
-          <w:p>
-            <w:r>
-              <w:t>Customer Contact</w:t>
-            </w:r>
-          </w:p>
-          <w:p>
-            <w:r>
-              <w:t>&amp;</w:t>
-            </w:r>
-          </w:p>
-          <w:p>
-            <w:r>
-              <w:t>Gesture Recognition Team</w:t>
-            </w:r>
-          </w:p>
-        </w:tc>
-        <w:tc>
-          <w:tcPr>
-            <w:tcW w:w="2352" w:type="dxa"/>
-          </w:tcPr>
-          <w:p>
-            <w:r>
-              <w:t>Customer Contact</w:t>
+            <w:shd w:val="clear" w:color="auto" w:fill="074F6A" w:themeFill="accent4" w:themeFillShade="80"/>
+          </w:tcPr>
+          <w:p>
+            <w:r>
+              <w:t>LM</w:t>
+            </w:r>
+          </w:p>
+        </w:tc>
+        <w:tc>
+          <w:tcPr>
+            <w:tcW w:w="2309" w:type="dxa"/>
+            <w:shd w:val="clear" w:color="auto" w:fill="074F6A" w:themeFill="accent4" w:themeFillShade="80"/>
+          </w:tcPr>
+          <w:p>
+            <w:r>
+              <w:t>LM</w:t>
+            </w:r>
+          </w:p>
+        </w:tc>
+        <w:tc>
+          <w:tcPr>
+            <w:tcW w:w="2269" w:type="dxa"/>
+            <w:shd w:val="clear" w:color="auto" w:fill="D86DCB" w:themeFill="accent5" w:themeFillTint="99"/>
+          </w:tcPr>
+          <w:p>
+            <w:r>
+              <w:t>CW</w:t>
+            </w:r>
+          </w:p>
+        </w:tc>
+        <w:tc>
+          <w:tcPr>
+            <w:tcW w:w="2735" w:type="dxa"/>
+            <w:shd w:val="clear" w:color="auto" w:fill="D86DCB" w:themeFill="accent5" w:themeFillTint="99"/>
+          </w:tcPr>
+          <w:p>
+            <w:r>
+              <w:t>CW</w:t>
             </w:r>
           </w:p>
         </w:tc>
@@ -680,7 +601,7 @@
         </w:trPr>
         <w:tc>
           <w:tcPr>
-            <w:tcW w:w="2127" w:type="dxa"/>
+            <w:tcW w:w="1423" w:type="dxa"/>
             <w:shd w:val="clear" w:color="auto" w:fill="83CAEB" w:themeFill="accent1" w:themeFillTint="66"/>
           </w:tcPr>
           <w:p>
@@ -692,62 +613,62 @@
         </w:tc>
         <w:tc>
           <w:tcPr>
+            <w:tcW w:w="2263" w:type="dxa"/>
+            <w:shd w:val="clear" w:color="auto" w:fill="F2CEED" w:themeFill="accent5" w:themeFillTint="33"/>
+          </w:tcPr>
+          <w:p>
+            <w:r>
+              <w:t>Week 7</w:t>
+            </w:r>
+          </w:p>
+        </w:tc>
+        <w:tc>
+          <w:tcPr>
+            <w:tcW w:w="2552" w:type="dxa"/>
+            <w:shd w:val="clear" w:color="auto" w:fill="F2CEED" w:themeFill="accent5" w:themeFillTint="33"/>
+          </w:tcPr>
+          <w:p>
+            <w:r>
+              <w:t>Week 8</w:t>
+            </w:r>
+          </w:p>
+        </w:tc>
+        <w:tc>
+          <w:tcPr>
             <w:tcW w:w="1984" w:type="dxa"/>
             <w:shd w:val="clear" w:color="auto" w:fill="F2CEED" w:themeFill="accent5" w:themeFillTint="33"/>
           </w:tcPr>
           <w:p>
             <w:r>
-              <w:t>Week 7</w:t>
-            </w:r>
-          </w:p>
-        </w:tc>
-        <w:tc>
-          <w:tcPr>
-            <w:tcW w:w="2127" w:type="dxa"/>
+              <w:t>Week 9</w:t>
+            </w:r>
+          </w:p>
+        </w:tc>
+        <w:tc>
+          <w:tcPr>
+            <w:tcW w:w="2309" w:type="dxa"/>
             <w:shd w:val="clear" w:color="auto" w:fill="F2CEED" w:themeFill="accent5" w:themeFillTint="33"/>
           </w:tcPr>
           <w:p>
             <w:r>
-              <w:t>Week 8</w:t>
-            </w:r>
-          </w:p>
-        </w:tc>
-        <w:tc>
-          <w:tcPr>
-            <w:tcW w:w="2268" w:type="dxa"/>
+              <w:t>Week 10</w:t>
+            </w:r>
+          </w:p>
+        </w:tc>
+        <w:tc>
+          <w:tcPr>
+            <w:tcW w:w="2269" w:type="dxa"/>
             <w:shd w:val="clear" w:color="auto" w:fill="F2CEED" w:themeFill="accent5" w:themeFillTint="33"/>
           </w:tcPr>
           <w:p>
             <w:r>
-              <w:t>Week 9</w:t>
-            </w:r>
-          </w:p>
-        </w:tc>
-        <w:tc>
-          <w:tcPr>
-            <w:tcW w:w="2268" w:type="dxa"/>
-            <w:shd w:val="clear" w:color="auto" w:fill="F2CEED" w:themeFill="accent5" w:themeFillTint="33"/>
-          </w:tcPr>
-          <w:p>
-            <w:r>
-              <w:t>Week 10</w:t>
-            </w:r>
-          </w:p>
-        </w:tc>
-        <w:tc>
-          <w:tcPr>
-            <w:tcW w:w="2409" w:type="dxa"/>
-            <w:shd w:val="clear" w:color="auto" w:fill="F2CEED" w:themeFill="accent5" w:themeFillTint="33"/>
-          </w:tcPr>
-          <w:p>
-            <w:r>
               <w:t>Week 11</w:t>
             </w:r>
           </w:p>
         </w:tc>
         <w:tc>
           <w:tcPr>
-            <w:tcW w:w="2352" w:type="dxa"/>
+            <w:tcW w:w="2735" w:type="dxa"/>
             <w:shd w:val="clear" w:color="auto" w:fill="F2CEED" w:themeFill="accent5" w:themeFillTint="33"/>
           </w:tcPr>
           <w:p>
@@ -763,83 +684,99 @@
         </w:trPr>
         <w:tc>
           <w:tcPr>
-            <w:tcW w:w="2127" w:type="dxa"/>
-          </w:tcPr>
-          <w:p>
-            <w:pPr>
-              <w:jc w:val="center"/>
-            </w:pPr>
+            <w:tcW w:w="1423" w:type="dxa"/>
+            <w:shd w:val="clear" w:color="auto" w:fill="83CAEB" w:themeFill="accent1" w:themeFillTint="66"/>
+          </w:tcPr>
+          <w:p>
+            <w:pPr>
+              <w:jc w:val="center"/>
+            </w:pPr>
+            <w:r>
+              <w:t>DH</w:t>
+            </w:r>
+          </w:p>
+        </w:tc>
+        <w:tc>
+          <w:tcPr>
+            <w:tcW w:w="2263" w:type="dxa"/>
+            <w:shd w:val="clear" w:color="auto" w:fill="BF4E14" w:themeFill="accent2" w:themeFillShade="BF"/>
+          </w:tcPr>
+          <w:p>
+            <w:pPr>
+              <w:jc w:val="center"/>
+            </w:pPr>
+            <w:r>
+              <w:t>DH</w:t>
+            </w:r>
+          </w:p>
+        </w:tc>
+        <w:tc>
+          <w:tcPr>
+            <w:tcW w:w="2552" w:type="dxa"/>
+            <w:shd w:val="clear" w:color="auto" w:fill="BF4E14" w:themeFill="accent2" w:themeFillShade="BF"/>
+          </w:tcPr>
+          <w:p>
+            <w:pPr>
+              <w:jc w:val="center"/>
+            </w:pPr>
+            <w:r>
+              <w:t>DH</w:t>
+            </w:r>
           </w:p>
         </w:tc>
         <w:tc>
           <w:tcPr>
             <w:tcW w:w="1984" w:type="dxa"/>
-          </w:tcPr>
-          <w:p>
-            <w:pPr>
-              <w:jc w:val="center"/>
-            </w:pPr>
-          </w:p>
-        </w:tc>
-        <w:tc>
-          <w:tcPr>
-            <w:tcW w:w="2127" w:type="dxa"/>
-          </w:tcPr>
-          <w:p>
-            <w:pPr>
-              <w:jc w:val="center"/>
-            </w:pPr>
-          </w:p>
-        </w:tc>
-        <w:tc>
-          <w:tcPr>
-            <w:tcW w:w="2268" w:type="dxa"/>
-          </w:tcPr>
-          <w:p>
-            <w:pPr>
-              <w:jc w:val="center"/>
-            </w:pPr>
-            <w:r>
-              <w:t>Customer Contact</w:t>
-            </w:r>
-          </w:p>
-        </w:tc>
-        <w:tc>
-          <w:tcPr>
-            <w:tcW w:w="2268" w:type="dxa"/>
-          </w:tcPr>
-          <w:p>
-            <w:pPr>
-              <w:jc w:val="center"/>
-            </w:pPr>
-            <w:r>
-              <w:t>Customer Contact</w:t>
-            </w:r>
-          </w:p>
-        </w:tc>
-        <w:tc>
-          <w:tcPr>
-            <w:tcW w:w="2409" w:type="dxa"/>
-          </w:tcPr>
-          <w:p>
-            <w:pPr>
-              <w:jc w:val="center"/>
-            </w:pPr>
-            <w:r>
-              <w:t>Customer Contact</w:t>
-            </w:r>
-          </w:p>
-        </w:tc>
-        <w:tc>
-          <w:tcPr>
-            <w:tcW w:w="2352" w:type="dxa"/>
-          </w:tcPr>
-          <w:p>
-            <w:pPr>
-              <w:jc w:val="center"/>
-            </w:pPr>
-            <w:r>
-              <w:t>Customer Contact</w:t>
+            <w:shd w:val="clear" w:color="auto" w:fill="074F6A" w:themeFill="accent4" w:themeFillShade="80"/>
+          </w:tcPr>
+          <w:p>
+            <w:pPr>
+              <w:jc w:val="center"/>
+            </w:pPr>
+            <w:r>
+              <w:t>LM</w:t>
+            </w:r>
+          </w:p>
+        </w:tc>
+        <w:tc>
+          <w:tcPr>
+            <w:tcW w:w="2309" w:type="dxa"/>
+            <w:shd w:val="clear" w:color="auto" w:fill="074F6A" w:themeFill="accent4" w:themeFillShade="80"/>
+          </w:tcPr>
+          <w:p>
+            <w:pPr>
+              <w:jc w:val="center"/>
+            </w:pPr>
+            <w:r>
+              <w:t>LM</w:t>
+            </w:r>
+          </w:p>
+        </w:tc>
+        <w:tc>
+          <w:tcPr>
+            <w:tcW w:w="2269" w:type="dxa"/>
+            <w:shd w:val="clear" w:color="auto" w:fill="074F6A" w:themeFill="accent4" w:themeFillShade="80"/>
+          </w:tcPr>
+          <w:p>
+            <w:pPr>
+              <w:jc w:val="center"/>
+            </w:pPr>
+            <w:r>
+              <w:t>LM</w:t>
+            </w:r>
+          </w:p>
+        </w:tc>
+        <w:tc>
+          <w:tcPr>
+            <w:tcW w:w="2735" w:type="dxa"/>
+            <w:shd w:val="clear" w:color="auto" w:fill="074F6A" w:themeFill="accent4" w:themeFillShade="80"/>
+          </w:tcPr>
+          <w:p>
+            <w:pPr>
+              <w:jc w:val="center"/>
+            </w:pPr>
+            <w:r>
+              <w:t>LM</w:t>
             </w:r>
           </w:p>
         </w:tc>
@@ -850,72 +787,100 @@
         </w:trPr>
         <w:tc>
           <w:tcPr>
-            <w:tcW w:w="2127" w:type="dxa"/>
-          </w:tcPr>
-          <w:p>
-            <w:pPr>
-              <w:jc w:val="center"/>
-            </w:pPr>
+            <w:tcW w:w="1423" w:type="dxa"/>
+            <w:shd w:val="clear" w:color="auto" w:fill="83CAEB" w:themeFill="accent1" w:themeFillTint="66"/>
+          </w:tcPr>
+          <w:p>
+            <w:pPr>
+              <w:jc w:val="center"/>
+            </w:pPr>
+            <w:r>
+              <w:t>MC</w:t>
+            </w:r>
+          </w:p>
+        </w:tc>
+        <w:tc>
+          <w:tcPr>
+            <w:tcW w:w="2263" w:type="dxa"/>
+            <w:shd w:val="clear" w:color="auto" w:fill="ADADAD" w:themeFill="background2" w:themeFillShade="BF"/>
+          </w:tcPr>
+          <w:p>
+            <w:pPr>
+              <w:jc w:val="center"/>
+            </w:pPr>
+            <w:r>
+              <w:t>MC</w:t>
+            </w:r>
+          </w:p>
+        </w:tc>
+        <w:tc>
+          <w:tcPr>
+            <w:tcW w:w="2552" w:type="dxa"/>
+            <w:shd w:val="clear" w:color="auto" w:fill="ADADAD" w:themeFill="background2" w:themeFillShade="BF"/>
+          </w:tcPr>
+          <w:p>
+            <w:pPr>
+              <w:jc w:val="center"/>
+            </w:pPr>
+            <w:r>
+              <w:t>MC</w:t>
+            </w:r>
           </w:p>
         </w:tc>
         <w:tc>
           <w:tcPr>
             <w:tcW w:w="1984" w:type="dxa"/>
-          </w:tcPr>
-          <w:p>
-            <w:pPr>
-              <w:jc w:val="center"/>
-            </w:pPr>
-          </w:p>
-        </w:tc>
-        <w:tc>
-          <w:tcPr>
-            <w:tcW w:w="2127" w:type="dxa"/>
-          </w:tcPr>
-          <w:p>
-            <w:pPr>
-              <w:jc w:val="center"/>
-            </w:pPr>
-          </w:p>
-        </w:tc>
-        <w:tc>
-          <w:tcPr>
-            <w:tcW w:w="2268" w:type="dxa"/>
-          </w:tcPr>
-          <w:p>
-            <w:pPr>
-              <w:jc w:val="center"/>
-            </w:pPr>
-          </w:p>
-        </w:tc>
-        <w:tc>
-          <w:tcPr>
-            <w:tcW w:w="2268" w:type="dxa"/>
-          </w:tcPr>
-          <w:p>
-            <w:pPr>
-              <w:jc w:val="center"/>
-            </w:pPr>
-          </w:p>
-        </w:tc>
-        <w:tc>
-          <w:tcPr>
-            <w:tcW w:w="2409" w:type="dxa"/>
-          </w:tcPr>
-          <w:p>
-            <w:pPr>
-              <w:jc w:val="center"/>
-            </w:pPr>
-          </w:p>
-        </w:tc>
-        <w:tc>
-          <w:tcPr>
-            <w:tcW w:w="2352" w:type="dxa"/>
-          </w:tcPr>
-          <w:p>
-            <w:pPr>
-              <w:jc w:val="center"/>
-            </w:pPr>
+            <w:shd w:val="clear" w:color="auto" w:fill="D86DCB" w:themeFill="accent5" w:themeFillTint="99"/>
+          </w:tcPr>
+          <w:p>
+            <w:pPr>
+              <w:jc w:val="center"/>
+            </w:pPr>
+            <w:r>
+              <w:t>CW</w:t>
+            </w:r>
+          </w:p>
+        </w:tc>
+        <w:tc>
+          <w:tcPr>
+            <w:tcW w:w="2309" w:type="dxa"/>
+            <w:shd w:val="clear" w:color="auto" w:fill="D86DCB" w:themeFill="accent5" w:themeFillTint="99"/>
+          </w:tcPr>
+          <w:p>
+            <w:pPr>
+              <w:jc w:val="center"/>
+            </w:pPr>
+            <w:r>
+              <w:t>CW</w:t>
+            </w:r>
+          </w:p>
+        </w:tc>
+        <w:tc>
+          <w:tcPr>
+            <w:tcW w:w="2269" w:type="dxa"/>
+            <w:shd w:val="clear" w:color="auto" w:fill="D86DCB" w:themeFill="accent5" w:themeFillTint="99"/>
+          </w:tcPr>
+          <w:p>
+            <w:pPr>
+              <w:jc w:val="center"/>
+            </w:pPr>
+            <w:r>
+              <w:t>CW</w:t>
+            </w:r>
+          </w:p>
+        </w:tc>
+        <w:tc>
+          <w:tcPr>
+            <w:tcW w:w="2735" w:type="dxa"/>
+            <w:shd w:val="clear" w:color="auto" w:fill="D86DCB" w:themeFill="accent5" w:themeFillTint="99"/>
+          </w:tcPr>
+          <w:p>
+            <w:pPr>
+              <w:jc w:val="center"/>
+            </w:pPr>
+            <w:r>
+              <w:t>CW</w:t>
+            </w:r>
           </w:p>
         </w:tc>
       </w:tr>
@@ -925,83 +890,99 @@
         </w:trPr>
         <w:tc>
           <w:tcPr>
-            <w:tcW w:w="2127" w:type="dxa"/>
-          </w:tcPr>
-          <w:p>
-            <w:pPr>
-              <w:jc w:val="center"/>
-            </w:pPr>
+            <w:tcW w:w="1423" w:type="dxa"/>
+            <w:shd w:val="clear" w:color="auto" w:fill="83CAEB" w:themeFill="accent1" w:themeFillTint="66"/>
+          </w:tcPr>
+          <w:p>
+            <w:pPr>
+              <w:jc w:val="center"/>
+            </w:pPr>
+            <w:r>
+              <w:t>TZ</w:t>
+            </w:r>
+          </w:p>
+        </w:tc>
+        <w:tc>
+          <w:tcPr>
+            <w:tcW w:w="2263" w:type="dxa"/>
+            <w:shd w:val="clear" w:color="auto" w:fill="84E290" w:themeFill="accent3" w:themeFillTint="66"/>
+          </w:tcPr>
+          <w:p>
+            <w:pPr>
+              <w:jc w:val="center"/>
+            </w:pPr>
+            <w:r>
+              <w:t>TZ</w:t>
+            </w:r>
+          </w:p>
+        </w:tc>
+        <w:tc>
+          <w:tcPr>
+            <w:tcW w:w="2552" w:type="dxa"/>
+            <w:shd w:val="clear" w:color="auto" w:fill="84E290" w:themeFill="accent3" w:themeFillTint="66"/>
+          </w:tcPr>
+          <w:p>
+            <w:pPr>
+              <w:jc w:val="center"/>
+            </w:pPr>
+            <w:r>
+              <w:t>TZ</w:t>
+            </w:r>
           </w:p>
         </w:tc>
         <w:tc>
           <w:tcPr>
             <w:tcW w:w="1984" w:type="dxa"/>
-          </w:tcPr>
-          <w:p>
-            <w:pPr>
-              <w:jc w:val="center"/>
-            </w:pPr>
-          </w:p>
-        </w:tc>
-        <w:tc>
-          <w:tcPr>
-            <w:tcW w:w="2127" w:type="dxa"/>
-          </w:tcPr>
-          <w:p>
-            <w:pPr>
-              <w:jc w:val="center"/>
-            </w:pPr>
-          </w:p>
-        </w:tc>
-        <w:tc>
-          <w:tcPr>
-            <w:tcW w:w="2268" w:type="dxa"/>
-          </w:tcPr>
-          <w:p>
-            <w:pPr>
-              <w:jc w:val="center"/>
-            </w:pPr>
-            <w:r>
-              <w:t>Project Manager</w:t>
-            </w:r>
-          </w:p>
-        </w:tc>
-        <w:tc>
-          <w:tcPr>
-            <w:tcW w:w="2268" w:type="dxa"/>
-          </w:tcPr>
-          <w:p>
-            <w:pPr>
-              <w:jc w:val="center"/>
-            </w:pPr>
-            <w:r>
-              <w:t>Project Manager</w:t>
-            </w:r>
-          </w:p>
-        </w:tc>
-        <w:tc>
-          <w:tcPr>
-            <w:tcW w:w="2409" w:type="dxa"/>
-          </w:tcPr>
-          <w:p>
-            <w:pPr>
-              <w:jc w:val="center"/>
-            </w:pPr>
-            <w:r>
-              <w:t>Project Manager</w:t>
-            </w:r>
-          </w:p>
-        </w:tc>
-        <w:tc>
-          <w:tcPr>
-            <w:tcW w:w="2352" w:type="dxa"/>
-          </w:tcPr>
-          <w:p>
-            <w:pPr>
-              <w:jc w:val="center"/>
-            </w:pPr>
-            <w:r>
-              <w:t>Project Manager</w:t>
+            <w:shd w:val="clear" w:color="auto" w:fill="EE0000"/>
+          </w:tcPr>
+          <w:p>
+            <w:pPr>
+              <w:jc w:val="center"/>
+            </w:pPr>
+            <w:r>
+              <w:t>DWA</w:t>
+            </w:r>
+          </w:p>
+        </w:tc>
+        <w:tc>
+          <w:tcPr>
+            <w:tcW w:w="2309" w:type="dxa"/>
+            <w:shd w:val="clear" w:color="auto" w:fill="EE0000"/>
+          </w:tcPr>
+          <w:p>
+            <w:pPr>
+              <w:jc w:val="center"/>
+            </w:pPr>
+            <w:r>
+              <w:t>DWA</w:t>
+            </w:r>
+          </w:p>
+        </w:tc>
+        <w:tc>
+          <w:tcPr>
+            <w:tcW w:w="2269" w:type="dxa"/>
+            <w:shd w:val="clear" w:color="auto" w:fill="EE0000"/>
+          </w:tcPr>
+          <w:p>
+            <w:pPr>
+              <w:jc w:val="center"/>
+            </w:pPr>
+            <w:r>
+              <w:t>DWA</w:t>
+            </w:r>
+          </w:p>
+        </w:tc>
+        <w:tc>
+          <w:tcPr>
+            <w:tcW w:w="2735" w:type="dxa"/>
+            <w:shd w:val="clear" w:color="auto" w:fill="EE0000"/>
+          </w:tcPr>
+          <w:p>
+            <w:pPr>
+              <w:jc w:val="center"/>
+            </w:pPr>
+            <w:r>
+              <w:t>DWA</w:t>
             </w:r>
           </w:p>
         </w:tc>
@@ -1012,81 +993,100 @@
         </w:trPr>
         <w:tc>
           <w:tcPr>
-            <w:tcW w:w="2127" w:type="dxa"/>
-          </w:tcPr>
-          <w:p>
-            <w:pPr>
-              <w:jc w:val="center"/>
-            </w:pPr>
-            <w:r>
-              <w:t>Project Manager</w:t>
+            <w:tcW w:w="1423" w:type="dxa"/>
+            <w:shd w:val="clear" w:color="auto" w:fill="83CAEB" w:themeFill="accent1" w:themeFillTint="66"/>
+          </w:tcPr>
+          <w:p>
+            <w:pPr>
+              <w:jc w:val="center"/>
+            </w:pPr>
+            <w:r>
+              <w:t>LM</w:t>
+            </w:r>
+          </w:p>
+        </w:tc>
+        <w:tc>
+          <w:tcPr>
+            <w:tcW w:w="2263" w:type="dxa"/>
+            <w:shd w:val="clear" w:color="auto" w:fill="074F6A" w:themeFill="accent4" w:themeFillShade="80"/>
+          </w:tcPr>
+          <w:p>
+            <w:pPr>
+              <w:jc w:val="center"/>
+            </w:pPr>
+            <w:r>
+              <w:t>LM</w:t>
+            </w:r>
+          </w:p>
+        </w:tc>
+        <w:tc>
+          <w:tcPr>
+            <w:tcW w:w="2552" w:type="dxa"/>
+            <w:shd w:val="clear" w:color="auto" w:fill="074F6A" w:themeFill="accent4" w:themeFillShade="80"/>
+          </w:tcPr>
+          <w:p>
+            <w:pPr>
+              <w:jc w:val="center"/>
+            </w:pPr>
+            <w:r>
+              <w:t>LM</w:t>
             </w:r>
           </w:p>
         </w:tc>
         <w:tc>
           <w:tcPr>
             <w:tcW w:w="1984" w:type="dxa"/>
-          </w:tcPr>
-          <w:p>
-            <w:pPr>
-              <w:jc w:val="center"/>
-            </w:pPr>
-            <w:r>
-              <w:t>Project Manager</w:t>
-            </w:r>
-          </w:p>
-        </w:tc>
-        <w:tc>
-          <w:tcPr>
-            <w:tcW w:w="2127" w:type="dxa"/>
-          </w:tcPr>
-          <w:p>
-            <w:pPr>
-              <w:jc w:val="center"/>
-            </w:pPr>
-            <w:r>
-              <w:t>Project Manager</w:t>
-            </w:r>
-          </w:p>
-        </w:tc>
-        <w:tc>
-          <w:tcPr>
-            <w:tcW w:w="2268" w:type="dxa"/>
-          </w:tcPr>
-          <w:p>
-            <w:pPr>
-              <w:jc w:val="center"/>
-            </w:pPr>
-          </w:p>
-        </w:tc>
-        <w:tc>
-          <w:tcPr>
-            <w:tcW w:w="2268" w:type="dxa"/>
-          </w:tcPr>
-          <w:p>
-            <w:pPr>
-              <w:jc w:val="center"/>
-            </w:pPr>
-          </w:p>
-        </w:tc>
-        <w:tc>
-          <w:tcPr>
-            <w:tcW w:w="2409" w:type="dxa"/>
-          </w:tcPr>
-          <w:p>
-            <w:pPr>
-              <w:jc w:val="center"/>
-            </w:pPr>
-          </w:p>
-        </w:tc>
-        <w:tc>
-          <w:tcPr>
-            <w:tcW w:w="2352" w:type="dxa"/>
-          </w:tcPr>
-          <w:p>
-            <w:pPr>
-              <w:jc w:val="center"/>
-            </w:pPr>
+            <w:shd w:val="clear" w:color="auto" w:fill="ADADAD" w:themeFill="background2" w:themeFillShade="BF"/>
+          </w:tcPr>
+          <w:p>
+            <w:pPr>
+              <w:jc w:val="center"/>
+            </w:pPr>
+            <w:r>
+              <w:t>MC</w:t>
+            </w:r>
+          </w:p>
+        </w:tc>
+        <w:tc>
+          <w:tcPr>
+            <w:tcW w:w="2309" w:type="dxa"/>
+            <w:shd w:val="clear" w:color="auto" w:fill="ADADAD" w:themeFill="background2" w:themeFillShade="BF"/>
+          </w:tcPr>
+          <w:p>
+            <w:pPr>
+              <w:jc w:val="center"/>
+            </w:pPr>
+            <w:r>
+              <w:t>MC</w:t>
+            </w:r>
+          </w:p>
+        </w:tc>
+        <w:tc>
+          <w:tcPr>
+            <w:tcW w:w="2269" w:type="dxa"/>
+            <w:shd w:val="clear" w:color="auto" w:fill="ADADAD" w:themeFill="background2" w:themeFillShade="BF"/>
+          </w:tcPr>
+          <w:p>
+            <w:pPr>
+              <w:jc w:val="center"/>
+            </w:pPr>
+            <w:r>
+              <w:t>MC</w:t>
+            </w:r>
+          </w:p>
+        </w:tc>
+        <w:tc>
+          <w:tcPr>
+            <w:tcW w:w="2735" w:type="dxa"/>
+            <w:shd w:val="clear" w:color="auto" w:fill="ADADAD" w:themeFill="background2" w:themeFillShade="BF"/>
+          </w:tcPr>
+          <w:p>
+            <w:pPr>
+              <w:jc w:val="center"/>
+            </w:pPr>
+            <w:r>
+              <w:t>MC</w:t>
+            </w:r>
           </w:p>
         </w:tc>
       </w:tr>
@@ -1096,72 +1096,100 @@
         </w:trPr>
         <w:tc>
           <w:tcPr>
-            <w:tcW w:w="2127" w:type="dxa"/>
-          </w:tcPr>
-          <w:p>
-            <w:pPr>
-              <w:jc w:val="center"/>
-            </w:pPr>
+            <w:tcW w:w="1423" w:type="dxa"/>
+            <w:shd w:val="clear" w:color="auto" w:fill="83CAEB" w:themeFill="accent1" w:themeFillTint="66"/>
+          </w:tcPr>
+          <w:p>
+            <w:pPr>
+              <w:jc w:val="center"/>
+            </w:pPr>
+            <w:r>
+              <w:t>DWA</w:t>
+            </w:r>
+          </w:p>
+        </w:tc>
+        <w:tc>
+          <w:tcPr>
+            <w:tcW w:w="2263" w:type="dxa"/>
+            <w:shd w:val="clear" w:color="auto" w:fill="EE0000"/>
+          </w:tcPr>
+          <w:p>
+            <w:pPr>
+              <w:jc w:val="center"/>
+            </w:pPr>
+            <w:r>
+              <w:t>DWA</w:t>
+            </w:r>
+          </w:p>
+        </w:tc>
+        <w:tc>
+          <w:tcPr>
+            <w:tcW w:w="2552" w:type="dxa"/>
+            <w:shd w:val="clear" w:color="auto" w:fill="EE0000"/>
+          </w:tcPr>
+          <w:p>
+            <w:pPr>
+              <w:jc w:val="center"/>
+            </w:pPr>
+            <w:r>
+              <w:t>DWA</w:t>
+            </w:r>
           </w:p>
         </w:tc>
         <w:tc>
           <w:tcPr>
             <w:tcW w:w="1984" w:type="dxa"/>
-          </w:tcPr>
-          <w:p>
-            <w:pPr>
-              <w:jc w:val="center"/>
-            </w:pPr>
-          </w:p>
-        </w:tc>
-        <w:tc>
-          <w:tcPr>
-            <w:tcW w:w="2127" w:type="dxa"/>
-          </w:tcPr>
-          <w:p>
-            <w:pPr>
-              <w:jc w:val="center"/>
-            </w:pPr>
-          </w:p>
-        </w:tc>
-        <w:tc>
-          <w:tcPr>
-            <w:tcW w:w="2268" w:type="dxa"/>
-          </w:tcPr>
-          <w:p>
-            <w:pPr>
-              <w:jc w:val="center"/>
-            </w:pPr>
-          </w:p>
-        </w:tc>
-        <w:tc>
-          <w:tcPr>
-            <w:tcW w:w="2268" w:type="dxa"/>
-          </w:tcPr>
-          <w:p>
-            <w:pPr>
-              <w:jc w:val="center"/>
-            </w:pPr>
-          </w:p>
-        </w:tc>
-        <w:tc>
-          <w:tcPr>
-            <w:tcW w:w="2409" w:type="dxa"/>
-          </w:tcPr>
-          <w:p>
-            <w:pPr>
-              <w:jc w:val="center"/>
-            </w:pPr>
-          </w:p>
-        </w:tc>
-        <w:tc>
-          <w:tcPr>
-            <w:tcW w:w="2352" w:type="dxa"/>
-          </w:tcPr>
-          <w:p>
-            <w:pPr>
-              <w:jc w:val="center"/>
-            </w:pPr>
+            <w:shd w:val="clear" w:color="auto" w:fill="84E290" w:themeFill="accent3" w:themeFillTint="66"/>
+          </w:tcPr>
+          <w:p>
+            <w:pPr>
+              <w:jc w:val="center"/>
+            </w:pPr>
+            <w:r>
+              <w:t>TZ</w:t>
+            </w:r>
+          </w:p>
+        </w:tc>
+        <w:tc>
+          <w:tcPr>
+            <w:tcW w:w="2309" w:type="dxa"/>
+            <w:shd w:val="clear" w:color="auto" w:fill="84E290" w:themeFill="accent3" w:themeFillTint="66"/>
+          </w:tcPr>
+          <w:p>
+            <w:pPr>
+              <w:jc w:val="center"/>
+            </w:pPr>
+            <w:r>
+              <w:t>TZ</w:t>
+            </w:r>
+          </w:p>
+        </w:tc>
+        <w:tc>
+          <w:tcPr>
+            <w:tcW w:w="2269" w:type="dxa"/>
+            <w:shd w:val="clear" w:color="auto" w:fill="84E290" w:themeFill="accent3" w:themeFillTint="66"/>
+          </w:tcPr>
+          <w:p>
+            <w:pPr>
+              <w:jc w:val="center"/>
+            </w:pPr>
+            <w:r>
+              <w:t>TZ</w:t>
+            </w:r>
+          </w:p>
+        </w:tc>
+        <w:tc>
+          <w:tcPr>
+            <w:tcW w:w="2735" w:type="dxa"/>
+            <w:shd w:val="clear" w:color="auto" w:fill="84E290" w:themeFill="accent3" w:themeFillTint="66"/>
+          </w:tcPr>
+          <w:p>
+            <w:pPr>
+              <w:jc w:val="center"/>
+            </w:pPr>
+            <w:r>
+              <w:t>TZ</w:t>
+            </w:r>
           </w:p>
         </w:tc>
       </w:tr>
@@ -1171,81 +1199,100 @@
         </w:trPr>
         <w:tc>
           <w:tcPr>
-            <w:tcW w:w="2127" w:type="dxa"/>
-          </w:tcPr>
-          <w:p>
-            <w:pPr>
-              <w:jc w:val="center"/>
-            </w:pPr>
-            <w:r>
-              <w:t>Customer Contact</w:t>
+            <w:tcW w:w="1423" w:type="dxa"/>
+            <w:shd w:val="clear" w:color="auto" w:fill="83CAEB" w:themeFill="accent1" w:themeFillTint="66"/>
+          </w:tcPr>
+          <w:p>
+            <w:pPr>
+              <w:jc w:val="center"/>
+            </w:pPr>
+            <w:r>
+              <w:t>CW</w:t>
+            </w:r>
+          </w:p>
+        </w:tc>
+        <w:tc>
+          <w:tcPr>
+            <w:tcW w:w="2263" w:type="dxa"/>
+            <w:shd w:val="clear" w:color="auto" w:fill="D86DCB" w:themeFill="accent5" w:themeFillTint="99"/>
+          </w:tcPr>
+          <w:p>
+            <w:pPr>
+              <w:jc w:val="center"/>
+            </w:pPr>
+            <w:r>
+              <w:t>CW</w:t>
+            </w:r>
+          </w:p>
+        </w:tc>
+        <w:tc>
+          <w:tcPr>
+            <w:tcW w:w="2552" w:type="dxa"/>
+            <w:shd w:val="clear" w:color="auto" w:fill="D86DCB" w:themeFill="accent5" w:themeFillTint="99"/>
+          </w:tcPr>
+          <w:p>
+            <w:pPr>
+              <w:jc w:val="center"/>
+            </w:pPr>
+            <w:r>
+              <w:t>CW</w:t>
             </w:r>
           </w:p>
         </w:tc>
         <w:tc>
           <w:tcPr>
             <w:tcW w:w="1984" w:type="dxa"/>
-          </w:tcPr>
-          <w:p>
-            <w:pPr>
-              <w:jc w:val="center"/>
-            </w:pPr>
-            <w:r>
-              <w:t>Customer Contact</w:t>
-            </w:r>
-          </w:p>
-        </w:tc>
-        <w:tc>
-          <w:tcPr>
-            <w:tcW w:w="2127" w:type="dxa"/>
-          </w:tcPr>
-          <w:p>
-            <w:pPr>
-              <w:jc w:val="center"/>
-            </w:pPr>
-            <w:r>
-              <w:t>Customer Contact</w:t>
-            </w:r>
-          </w:p>
-        </w:tc>
-        <w:tc>
-          <w:tcPr>
-            <w:tcW w:w="2268" w:type="dxa"/>
-          </w:tcPr>
-          <w:p>
-            <w:pPr>
-              <w:jc w:val="center"/>
-            </w:pPr>
-          </w:p>
-        </w:tc>
-        <w:tc>
-          <w:tcPr>
-            <w:tcW w:w="2268" w:type="dxa"/>
-          </w:tcPr>
-          <w:p>
-            <w:pPr>
-              <w:jc w:val="center"/>
-            </w:pPr>
-          </w:p>
-        </w:tc>
-        <w:tc>
-          <w:tcPr>
-            <w:tcW w:w="2409" w:type="dxa"/>
-          </w:tcPr>
-          <w:p>
-            <w:pPr>
-              <w:jc w:val="center"/>
-            </w:pPr>
-          </w:p>
-        </w:tc>
-        <w:tc>
-          <w:tcPr>
-            <w:tcW w:w="2352" w:type="dxa"/>
-          </w:tcPr>
-          <w:p>
-            <w:pPr>
-              <w:jc w:val="center"/>
-            </w:pPr>
+            <w:shd w:val="clear" w:color="auto" w:fill="BF4E14" w:themeFill="accent2" w:themeFillShade="BF"/>
+          </w:tcPr>
+          <w:p>
+            <w:pPr>
+              <w:jc w:val="center"/>
+            </w:pPr>
+            <w:r>
+              <w:t>DH</w:t>
+            </w:r>
+          </w:p>
+        </w:tc>
+        <w:tc>
+          <w:tcPr>
+            <w:tcW w:w="2309" w:type="dxa"/>
+            <w:shd w:val="clear" w:color="auto" w:fill="BF4E14" w:themeFill="accent2" w:themeFillShade="BF"/>
+          </w:tcPr>
+          <w:p>
+            <w:pPr>
+              <w:jc w:val="center"/>
+            </w:pPr>
+            <w:r>
+              <w:t>DH</w:t>
+            </w:r>
+          </w:p>
+        </w:tc>
+        <w:tc>
+          <w:tcPr>
+            <w:tcW w:w="2269" w:type="dxa"/>
+            <w:shd w:val="clear" w:color="auto" w:fill="BF4E14" w:themeFill="accent2" w:themeFillShade="BF"/>
+          </w:tcPr>
+          <w:p>
+            <w:pPr>
+              <w:jc w:val="center"/>
+            </w:pPr>
+            <w:r>
+              <w:t>DH</w:t>
+            </w:r>
+          </w:p>
+        </w:tc>
+        <w:tc>
+          <w:tcPr>
+            <w:tcW w:w="2735" w:type="dxa"/>
+            <w:shd w:val="clear" w:color="auto" w:fill="BF4E14" w:themeFill="accent2" w:themeFillShade="BF"/>
+          </w:tcPr>
+          <w:p>
+            <w:pPr>
+              <w:jc w:val="center"/>
+            </w:pPr>
+            <w:r>
+              <w:t>DH</w:t>
+            </w:r>
           </w:p>
         </w:tc>
       </w:tr>

</xml_diff>